<commit_message>
Added Contact Page and Started implementing hamburger slider
There are bugs regrading the slider that include:

Slider not activating when hamburger logo is pressed

Cart Icon is misalighned
</commit_message>
<xml_diff>
--- a/WEBSITE DEVELOPMENT AGREEMENT.docx
+++ b/WEBSITE DEVELOPMENT AGREEMENT.docx
@@ -160,6 +160,9 @@
     </w:p>
     <w:p>
       <w:pPr>
+        <w:pBdr>
+          <w:bottom w:val="single" w:sz="4" w:space="1" w:color="auto"/>
+        </w:pBdr>
         <w:spacing w:after="0" w:line="276" w:lineRule="auto"/>
         <w:rPr>
           <w:rFonts w:asciiTheme="majorBidi" w:hAnsiTheme="majorBidi" w:cstheme="majorBidi"/>
@@ -184,13 +187,8 @@
         </w:rPr>
       </w:pPr>
       <w:r>
-        <w:rPr>
-          <w:noProof/>
-        </w:rPr>
-      </w:r>
-      <w:r>
-        <w:pict w14:anchorId="65B0D099">
-          <v:rect id="Horizontal Line 1" o:spid="_x0000_s1036" style="width:468pt;height:.05pt;visibility:visible;mso-wrap-style:square;mso-left-percent:-10001;mso-top-percent:-10001;mso-position-horizontal:absolute;mso-position-horizontal-relative:char;mso-position-vertical:absolute;mso-position-vertical-relative:line;mso-left-percent:-10001;mso-top-percent:-10001;v-text-anchor:top" o:gfxdata="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" filled="f">
+        <w:pict w14:anchorId="752E9E1B">
+          <v:rect id="Horizontal Line 1" o:spid="_x0000_s1029" alt="" style="width:468pt;height:.05pt;visibility:visible;mso-wrap-style:square;mso-width-percent:0;mso-height-percent:0;mso-left-percent:-10001;mso-top-percent:-10001;mso-position-horizontal:absolute;mso-position-horizontal-relative:char;mso-position-vertical:absolute;mso-position-vertical-relative:line;mso-width-percent:0;mso-height-percent:0;mso-left-percent:-10001;mso-top-percent:-10001;v-text-anchor:top" filled="f">
             <o:lock v:ext="edit" rotation="t" aspectratio="t" verticies="t" text="t" shapetype="t"/>
             <w10:anchorlock/>
           </v:rect>
@@ -467,6 +465,9 @@
     </w:p>
     <w:p>
       <w:pPr>
+        <w:pBdr>
+          <w:bottom w:val="single" w:sz="4" w:space="1" w:color="auto"/>
+        </w:pBdr>
         <w:spacing w:line="276" w:lineRule="auto"/>
         <w:rPr>
           <w:rFonts w:asciiTheme="majorBidi" w:hAnsiTheme="majorBidi" w:cstheme="majorBidi"/>
@@ -488,13 +489,8 @@
         </w:rPr>
       </w:pPr>
       <w:r>
-        <w:rPr>
-          <w:noProof/>
-        </w:rPr>
-      </w:r>
-      <w:r>
-        <w:pict w14:anchorId="61F75A5A">
-          <v:rect id="Horizontal Line 2" o:spid="_x0000_s1035" style="width:468pt;height:.05pt;visibility:visible;mso-wrap-style:square;mso-left-percent:-10001;mso-top-percent:-10001;mso-position-horizontal:absolute;mso-position-horizontal-relative:char;mso-position-vertical:absolute;mso-position-vertical-relative:line;mso-left-percent:-10001;mso-top-percent:-10001;v-text-anchor:top" o:gfxdata="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" filled="f">
+        <w:pict w14:anchorId="3E8B8438">
+          <v:rect id="Horizontal Line 2" o:spid="_x0000_s1028" alt="" style="width:468pt;height:.05pt;visibility:visible;mso-wrap-style:square;mso-width-percent:0;mso-height-percent:0;mso-left-percent:-10001;mso-top-percent:-10001;mso-position-horizontal:absolute;mso-position-horizontal-relative:char;mso-position-vertical:absolute;mso-position-vertical-relative:line;mso-width-percent:0;mso-height-percent:0;mso-left-percent:-10001;mso-top-percent:-10001;v-text-anchor:top" filled="f">
             <o:lock v:ext="edit" rotation="t" aspectratio="t" verticies="t" text="t" shapetype="t"/>
             <w10:anchorlock/>
           </v:rect>
@@ -701,6 +697,9 @@
           <w:ilvl w:val="0"/>
           <w:numId w:val="10"/>
         </w:numPr>
+        <w:pBdr>
+          <w:bottom w:val="single" w:sz="4" w:space="1" w:color="auto"/>
+        </w:pBdr>
         <w:spacing w:line="276" w:lineRule="auto"/>
         <w:rPr>
           <w:rFonts w:asciiTheme="majorBidi" w:hAnsiTheme="majorBidi" w:cstheme="majorBidi"/>
@@ -721,13 +720,8 @@
         </w:rPr>
       </w:pPr>
       <w:r>
-        <w:rPr>
-          <w:noProof/>
-        </w:rPr>
-      </w:r>
-      <w:r>
-        <w:pict w14:anchorId="5FE8FDAA">
-          <v:rect id="Horizontal Line 3" o:spid="_x0000_s1034" style="width:468pt;height:.05pt;visibility:visible;mso-wrap-style:square;mso-left-percent:-10001;mso-top-percent:-10001;mso-position-horizontal:absolute;mso-position-horizontal-relative:char;mso-position-vertical:absolute;mso-position-vertical-relative:line;mso-left-percent:-10001;mso-top-percent:-10001;v-text-anchor:top" o:gfxdata="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" filled="f">
+        <w:pict w14:anchorId="1286E17F">
+          <v:rect id="Horizontal Line 3" o:spid="_x0000_s1027" alt="" style="width:468pt;height:.05pt;visibility:visible;mso-wrap-style:square;mso-width-percent:0;mso-height-percent:0;mso-left-percent:-10001;mso-top-percent:-10001;mso-position-horizontal:absolute;mso-position-horizontal-relative:char;mso-position-vertical:absolute;mso-position-vertical-relative:line;mso-width-percent:0;mso-height-percent:0;mso-left-percent:-10001;mso-top-percent:-10001;v-text-anchor:top" filled="f">
             <o:lock v:ext="edit" rotation="t" aspectratio="t" verticies="t" text="t" shapetype="t"/>
             <w10:anchorlock/>
           </v:rect>
@@ -1531,6 +1525,9 @@
     </w:p>
     <w:p>
       <w:pPr>
+        <w:pBdr>
+          <w:bottom w:val="single" w:sz="4" w:space="1" w:color="auto"/>
+        </w:pBdr>
         <w:spacing w:line="276" w:lineRule="auto"/>
         <w:rPr>
           <w:rFonts w:asciiTheme="majorBidi" w:hAnsiTheme="majorBidi" w:cstheme="majorBidi"/>
@@ -1546,24 +1543,6 @@
     <w:p>
       <w:pPr>
         <w:spacing w:line="276" w:lineRule="auto"/>
-        <w:rPr>
-          <w:rFonts w:asciiTheme="majorBidi" w:hAnsiTheme="majorBidi" w:cstheme="majorBidi"/>
-        </w:rPr>
-      </w:pPr>
-      <w:r>
-        <w:rPr>
-          <w:noProof/>
-        </w:rPr>
-      </w:r>
-      <w:r>
-        <w:pict w14:anchorId="6F69FD59">
-          <v:rect id="Horizontal Line 4" o:spid="_x0000_s1033" style="width:468pt;height:.05pt;visibility:visible;mso-wrap-style:square;mso-left-percent:-10001;mso-top-percent:-10001;mso-position-horizontal:absolute;mso-position-horizontal-relative:char;mso-position-vertical:absolute;mso-position-vertical-relative:line;mso-left-percent:-10001;mso-top-percent:-10001;v-text-anchor:top" o:gfxdata="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" filled="f">
-            <o:lock v:ext="edit" rotation="t" aspectratio="t" verticies="t" text="t" shapetype="t"/>
-            <w10:anchorlock/>
-          </v:rect>
-        </w:pict>
-      </w:r>
-      <w:r>
         <w:rPr>
           <w:rFonts w:asciiTheme="majorBidi" w:hAnsiTheme="majorBidi" w:cstheme="majorBidi"/>
           <w:b/>
@@ -1571,8 +1550,7 @@
           <w:sz w:val="28"/>
           <w:szCs w:val="28"/>
         </w:rPr>
-        <w:t>6</w:t>
-      </w:r>
+      </w:pPr>
       <w:r>
         <w:rPr>
           <w:rFonts w:asciiTheme="majorBidi" w:hAnsiTheme="majorBidi" w:cstheme="majorBidi"/>
@@ -1581,86 +1559,7 @@
           <w:sz w:val="28"/>
           <w:szCs w:val="28"/>
         </w:rPr>
-        <w:t>. Timeline</w:t>
-      </w:r>
-    </w:p>
-    <w:p>
-      <w:pPr>
-        <w:spacing w:line="276" w:lineRule="auto"/>
-        <w:rPr>
-          <w:rFonts w:asciiTheme="majorBidi" w:hAnsiTheme="majorBidi" w:cstheme="majorBidi"/>
-        </w:rPr>
-      </w:pPr>
-      <w:r>
-        <w:rPr>
-          <w:rFonts w:asciiTheme="majorBidi" w:hAnsiTheme="majorBidi" w:cstheme="majorBidi"/>
-        </w:rPr>
-        <w:t>The project will begin once the deposit and required materials are received.</w:t>
-      </w:r>
-    </w:p>
-    <w:p>
-      <w:pPr>
-        <w:spacing w:line="276" w:lineRule="auto"/>
-        <w:rPr>
-          <w:rFonts w:asciiTheme="majorBidi" w:hAnsiTheme="majorBidi" w:cstheme="majorBidi"/>
-        </w:rPr>
-      </w:pPr>
-      <w:r>
-        <w:rPr>
-          <w:rFonts w:asciiTheme="majorBidi" w:hAnsiTheme="majorBidi" w:cstheme="majorBidi"/>
-        </w:rPr>
-        <w:t>Estimated completion timeline: </w:t>
-      </w:r>
-      <w:r>
-        <w:rPr>
-          <w:rFonts w:asciiTheme="majorBidi" w:hAnsiTheme="majorBidi" w:cstheme="majorBidi"/>
-          <w:b/>
-          <w:bCs/>
-        </w:rPr>
-        <w:t xml:space="preserve">6 </w:t>
-      </w:r>
-      <w:r>
-        <w:rPr>
-          <w:rFonts w:asciiTheme="majorBidi" w:hAnsiTheme="majorBidi" w:cstheme="majorBidi"/>
-          <w:b/>
-          <w:bCs/>
-        </w:rPr>
-        <w:t>weeks</w:t>
-      </w:r>
-    </w:p>
-    <w:p>
-      <w:pPr>
-        <w:spacing w:line="276" w:lineRule="auto"/>
-        <w:rPr>
-          <w:rFonts w:asciiTheme="majorBidi" w:hAnsiTheme="majorBidi" w:cstheme="majorBidi"/>
-        </w:rPr>
-      </w:pPr>
-      <w:r>
-        <w:rPr>
-          <w:rFonts w:asciiTheme="majorBidi" w:hAnsiTheme="majorBidi" w:cstheme="majorBidi"/>
-        </w:rPr>
-        <w:t>Delays in receiving materials, approvals, or feedback may extend the project timeline.</w:t>
-      </w:r>
-    </w:p>
-    <w:p>
-      <w:pPr>
-        <w:spacing w:line="276" w:lineRule="auto"/>
-        <w:rPr>
-          <w:rFonts w:asciiTheme="majorBidi" w:hAnsiTheme="majorBidi" w:cstheme="majorBidi"/>
-        </w:rPr>
-      </w:pPr>
-      <w:r>
-        <w:rPr>
-          <w:noProof/>
-        </w:rPr>
-      </w:r>
-      <w:r>
-        <w:pict w14:anchorId="78467231">
-          <v:rect id="Horizontal Line 5" o:spid="_x0000_s1032" style="width:468pt;height:.05pt;visibility:visible;mso-wrap-style:square;mso-left-percent:-10001;mso-top-percent:-10001;mso-position-horizontal:absolute;mso-position-horizontal-relative:char;mso-position-vertical:absolute;mso-position-vertical-relative:line;mso-left-percent:-10001;mso-top-percent:-10001;v-text-anchor:top" o:gfxdata="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" filled="f">
-            <o:lock v:ext="edit" rotation="t" aspectratio="t" verticies="t" text="t" shapetype="t"/>
-            <w10:anchorlock/>
-          </v:rect>
-        </w:pict>
+        <w:t>6</w:t>
       </w:r>
       <w:r>
         <w:rPr>
@@ -1670,8 +1569,366 @@
           <w:sz w:val="28"/>
           <w:szCs w:val="28"/>
         </w:rPr>
-        <w:t>7</w:t>
-      </w:r>
+        <w:t>. Payment Methods</w:t>
+      </w:r>
+    </w:p>
+    <w:p>
+      <w:pPr>
+        <w:spacing w:line="276" w:lineRule="auto"/>
+        <w:rPr>
+          <w:rFonts w:asciiTheme="majorBidi" w:hAnsiTheme="majorBidi" w:cstheme="majorBidi"/>
+        </w:rPr>
+      </w:pPr>
+      <w:r>
+        <w:rPr>
+          <w:rFonts w:asciiTheme="majorBidi" w:hAnsiTheme="majorBidi" w:cstheme="majorBidi"/>
+        </w:rPr>
+        <w:t>All installment payments must be sent to the Developer via one of the following platforms:</w:t>
+      </w:r>
+    </w:p>
+    <w:tbl>
+      <w:tblPr>
+        <w:tblW w:w="9360" w:type="dxa"/>
+        <w:tblBorders>
+          <w:top w:val="single" w:sz="4" w:space="0" w:color="auto"/>
+          <w:left w:val="single" w:sz="4" w:space="0" w:color="auto"/>
+          <w:bottom w:val="single" w:sz="4" w:space="0" w:color="auto"/>
+          <w:right w:val="single" w:sz="4" w:space="0" w:color="auto"/>
+          <w:insideH w:val="single" w:sz="4" w:space="0" w:color="auto"/>
+          <w:insideV w:val="single" w:sz="4" w:space="0" w:color="auto"/>
+        </w:tblBorders>
+        <w:tblCellMar>
+          <w:left w:w="10" w:type="dxa"/>
+          <w:right w:w="10" w:type="dxa"/>
+        </w:tblCellMar>
+        <w:tblLook w:val="0000" w:firstRow="0" w:lastRow="0" w:firstColumn="0" w:lastColumn="0" w:noHBand="0" w:noVBand="0"/>
+      </w:tblPr>
+      <w:tblGrid>
+        <w:gridCol w:w="2200"/>
+        <w:gridCol w:w="7160"/>
+      </w:tblGrid>
+      <w:tr>
+        <w:trPr>
+          <w:tblHeader/>
+        </w:trPr>
+        <w:tc>
+          <w:tcPr>
+            <w:tcW w:w="2200" w:type="dxa"/>
+            <w:tcBorders>
+              <w:top w:val="single" w:sz="1" w:space="0" w:color="CCCCCC"/>
+              <w:left w:val="single" w:sz="1" w:space="0" w:color="CCCCCC"/>
+              <w:bottom w:val="single" w:sz="1" w:space="0" w:color="CCCCCC"/>
+              <w:right w:val="single" w:sz="1" w:space="0" w:color="CCCCCC"/>
+            </w:tcBorders>
+            <w:shd w:val="clear" w:color="auto" w:fill="1A1A1A"/>
+            <w:tcMar>
+              <w:top w:w="80" w:type="dxa"/>
+              <w:left w:w="120" w:type="dxa"/>
+              <w:bottom w:w="80" w:type="dxa"/>
+              <w:right w:w="120" w:type="dxa"/>
+            </w:tcMar>
+          </w:tcPr>
+          <w:p>
+            <w:pPr>
+              <w:spacing w:line="276" w:lineRule="auto"/>
+              <w:rPr>
+                <w:rFonts w:asciiTheme="majorBidi" w:hAnsiTheme="majorBidi" w:cstheme="majorBidi"/>
+              </w:rPr>
+            </w:pPr>
+            <w:r>
+              <w:rPr>
+                <w:rFonts w:asciiTheme="majorBidi" w:hAnsiTheme="majorBidi" w:cstheme="majorBidi"/>
+                <w:b/>
+                <w:bCs/>
+              </w:rPr>
+              <w:t>Platform</w:t>
+            </w:r>
+          </w:p>
+        </w:tc>
+        <w:tc>
+          <w:tcPr>
+            <w:tcW w:w="7160" w:type="dxa"/>
+            <w:tcBorders>
+              <w:top w:val="single" w:sz="1" w:space="0" w:color="CCCCCC"/>
+              <w:left w:val="single" w:sz="1" w:space="0" w:color="CCCCCC"/>
+              <w:bottom w:val="single" w:sz="1" w:space="0" w:color="CCCCCC"/>
+              <w:right w:val="single" w:sz="1" w:space="0" w:color="CCCCCC"/>
+            </w:tcBorders>
+            <w:shd w:val="clear" w:color="auto" w:fill="1A1A1A"/>
+            <w:tcMar>
+              <w:top w:w="80" w:type="dxa"/>
+              <w:left w:w="120" w:type="dxa"/>
+              <w:bottom w:w="80" w:type="dxa"/>
+              <w:right w:w="120" w:type="dxa"/>
+            </w:tcMar>
+          </w:tcPr>
+          <w:p>
+            <w:pPr>
+              <w:spacing w:line="276" w:lineRule="auto"/>
+              <w:rPr>
+                <w:rFonts w:asciiTheme="majorBidi" w:hAnsiTheme="majorBidi" w:cstheme="majorBidi"/>
+              </w:rPr>
+            </w:pPr>
+            <w:r>
+              <w:rPr>
+                <w:rFonts w:asciiTheme="majorBidi" w:hAnsiTheme="majorBidi" w:cstheme="majorBidi"/>
+                <w:b/>
+                <w:bCs/>
+              </w:rPr>
+              <w:t>Send To</w:t>
+            </w:r>
+          </w:p>
+        </w:tc>
+      </w:tr>
+      <w:tr>
+        <w:tc>
+          <w:tcPr>
+            <w:tcW w:w="2200" w:type="dxa"/>
+            <w:tcBorders>
+              <w:top w:val="single" w:sz="1" w:space="0" w:color="CCCCCC"/>
+              <w:left w:val="single" w:sz="1" w:space="0" w:color="CCCCCC"/>
+              <w:bottom w:val="single" w:sz="1" w:space="0" w:color="CCCCCC"/>
+              <w:right w:val="single" w:sz="1" w:space="0" w:color="CCCCCC"/>
+            </w:tcBorders>
+            <w:tcMar>
+              <w:top w:w="80" w:type="dxa"/>
+              <w:left w:w="120" w:type="dxa"/>
+              <w:bottom w:w="80" w:type="dxa"/>
+              <w:right w:w="120" w:type="dxa"/>
+            </w:tcMar>
+          </w:tcPr>
+          <w:p>
+            <w:pPr>
+              <w:spacing w:line="276" w:lineRule="auto"/>
+              <w:rPr>
+                <w:rFonts w:asciiTheme="majorBidi" w:hAnsiTheme="majorBidi" w:cstheme="majorBidi"/>
+              </w:rPr>
+            </w:pPr>
+            <w:r>
+              <w:rPr>
+                <w:rFonts w:asciiTheme="majorBidi" w:hAnsiTheme="majorBidi" w:cstheme="majorBidi"/>
+                <w:b/>
+                <w:bCs/>
+              </w:rPr>
+              <w:t>Cash App</w:t>
+            </w:r>
+          </w:p>
+        </w:tc>
+        <w:tc>
+          <w:tcPr>
+            <w:tcW w:w="7160" w:type="dxa"/>
+            <w:tcBorders>
+              <w:top w:val="single" w:sz="1" w:space="0" w:color="CCCCCC"/>
+              <w:left w:val="single" w:sz="1" w:space="0" w:color="CCCCCC"/>
+              <w:bottom w:val="single" w:sz="1" w:space="0" w:color="CCCCCC"/>
+              <w:right w:val="single" w:sz="1" w:space="0" w:color="CCCCCC"/>
+            </w:tcBorders>
+            <w:tcMar>
+              <w:top w:w="80" w:type="dxa"/>
+              <w:left w:w="120" w:type="dxa"/>
+              <w:bottom w:w="80" w:type="dxa"/>
+              <w:right w:w="120" w:type="dxa"/>
+            </w:tcMar>
+          </w:tcPr>
+          <w:p>
+            <w:pPr>
+              <w:spacing w:line="276" w:lineRule="auto"/>
+              <w:rPr>
+                <w:rFonts w:asciiTheme="majorBidi" w:hAnsiTheme="majorBidi" w:cstheme="majorBidi"/>
+              </w:rPr>
+            </w:pPr>
+            <w:r>
+              <w:rPr>
+                <w:rFonts w:asciiTheme="majorBidi" w:hAnsiTheme="majorBidi" w:cstheme="majorBidi"/>
+              </w:rPr>
+              <w:t>$sozark7</w:t>
+            </w:r>
+          </w:p>
+        </w:tc>
+      </w:tr>
+      <w:tr>
+        <w:tc>
+          <w:tcPr>
+            <w:tcW w:w="2200" w:type="dxa"/>
+            <w:tcBorders>
+              <w:top w:val="single" w:sz="1" w:space="0" w:color="CCCCCC"/>
+              <w:left w:val="single" w:sz="1" w:space="0" w:color="CCCCCC"/>
+              <w:bottom w:val="single" w:sz="1" w:space="0" w:color="CCCCCC"/>
+              <w:right w:val="single" w:sz="1" w:space="0" w:color="CCCCCC"/>
+            </w:tcBorders>
+            <w:shd w:val="clear" w:color="auto" w:fill="F7F7F7"/>
+            <w:tcMar>
+              <w:top w:w="80" w:type="dxa"/>
+              <w:left w:w="120" w:type="dxa"/>
+              <w:bottom w:w="80" w:type="dxa"/>
+              <w:right w:w="120" w:type="dxa"/>
+            </w:tcMar>
+          </w:tcPr>
+          <w:p>
+            <w:pPr>
+              <w:spacing w:line="276" w:lineRule="auto"/>
+              <w:rPr>
+                <w:rFonts w:asciiTheme="majorBidi" w:hAnsiTheme="majorBidi" w:cstheme="majorBidi"/>
+              </w:rPr>
+            </w:pPr>
+            <w:r>
+              <w:rPr>
+                <w:rFonts w:asciiTheme="majorBidi" w:hAnsiTheme="majorBidi" w:cstheme="majorBidi"/>
+                <w:b/>
+                <w:bCs/>
+              </w:rPr>
+              <w:t>Venmo</w:t>
+            </w:r>
+          </w:p>
+        </w:tc>
+        <w:tc>
+          <w:tcPr>
+            <w:tcW w:w="7160" w:type="dxa"/>
+            <w:tcBorders>
+              <w:top w:val="single" w:sz="1" w:space="0" w:color="CCCCCC"/>
+              <w:left w:val="single" w:sz="1" w:space="0" w:color="CCCCCC"/>
+              <w:bottom w:val="single" w:sz="1" w:space="0" w:color="CCCCCC"/>
+              <w:right w:val="single" w:sz="1" w:space="0" w:color="CCCCCC"/>
+            </w:tcBorders>
+            <w:shd w:val="clear" w:color="auto" w:fill="F7F7F7"/>
+            <w:tcMar>
+              <w:top w:w="80" w:type="dxa"/>
+              <w:left w:w="120" w:type="dxa"/>
+              <w:bottom w:w="80" w:type="dxa"/>
+              <w:right w:w="120" w:type="dxa"/>
+            </w:tcMar>
+          </w:tcPr>
+          <w:p>
+            <w:pPr>
+              <w:spacing w:line="276" w:lineRule="auto"/>
+              <w:rPr>
+                <w:rFonts w:asciiTheme="majorBidi" w:hAnsiTheme="majorBidi" w:cstheme="majorBidi"/>
+              </w:rPr>
+            </w:pPr>
+            <w:r>
+              <w:rPr>
+                <w:rFonts w:asciiTheme="majorBidi" w:hAnsiTheme="majorBidi" w:cstheme="majorBidi"/>
+              </w:rPr>
+              <w:t>@Noah-Jones-142</w:t>
+            </w:r>
+          </w:p>
+        </w:tc>
+      </w:tr>
+      <w:tr>
+        <w:tc>
+          <w:tcPr>
+            <w:tcW w:w="2200" w:type="dxa"/>
+            <w:tcBorders>
+              <w:top w:val="single" w:sz="1" w:space="0" w:color="CCCCCC"/>
+              <w:left w:val="single" w:sz="1" w:space="0" w:color="CCCCCC"/>
+              <w:bottom w:val="single" w:sz="1" w:space="0" w:color="CCCCCC"/>
+              <w:right w:val="single" w:sz="1" w:space="0" w:color="CCCCCC"/>
+            </w:tcBorders>
+            <w:tcMar>
+              <w:top w:w="80" w:type="dxa"/>
+              <w:left w:w="120" w:type="dxa"/>
+              <w:bottom w:w="80" w:type="dxa"/>
+              <w:right w:w="120" w:type="dxa"/>
+            </w:tcMar>
+          </w:tcPr>
+          <w:p>
+            <w:pPr>
+              <w:spacing w:line="276" w:lineRule="auto"/>
+              <w:rPr>
+                <w:rFonts w:asciiTheme="majorBidi" w:hAnsiTheme="majorBidi" w:cstheme="majorBidi"/>
+              </w:rPr>
+            </w:pPr>
+            <w:r>
+              <w:rPr>
+                <w:rFonts w:asciiTheme="majorBidi" w:hAnsiTheme="majorBidi" w:cstheme="majorBidi"/>
+                <w:b/>
+                <w:bCs/>
+              </w:rPr>
+              <w:t>Zelle</w:t>
+            </w:r>
+          </w:p>
+        </w:tc>
+        <w:tc>
+          <w:tcPr>
+            <w:tcW w:w="7160" w:type="dxa"/>
+            <w:tcBorders>
+              <w:top w:val="single" w:sz="1" w:space="0" w:color="CCCCCC"/>
+              <w:left w:val="single" w:sz="1" w:space="0" w:color="CCCCCC"/>
+              <w:bottom w:val="single" w:sz="1" w:space="0" w:color="CCCCCC"/>
+              <w:right w:val="single" w:sz="1" w:space="0" w:color="CCCCCC"/>
+            </w:tcBorders>
+            <w:tcMar>
+              <w:top w:w="80" w:type="dxa"/>
+              <w:left w:w="120" w:type="dxa"/>
+              <w:bottom w:w="80" w:type="dxa"/>
+              <w:right w:w="120" w:type="dxa"/>
+            </w:tcMar>
+          </w:tcPr>
+          <w:p>
+            <w:pPr>
+              <w:spacing w:line="276" w:lineRule="auto"/>
+              <w:rPr>
+                <w:rFonts w:asciiTheme="majorBidi" w:hAnsiTheme="majorBidi" w:cstheme="majorBidi"/>
+              </w:rPr>
+            </w:pPr>
+            <w:r>
+              <w:rPr>
+                <w:rFonts w:asciiTheme="majorBidi" w:hAnsiTheme="majorBidi" w:cstheme="majorBidi"/>
+              </w:rPr>
+              <w:t>jonesncharbonnet@gmail.com(phone or email)</w:t>
+            </w:r>
+          </w:p>
+        </w:tc>
+      </w:tr>
+    </w:tbl>
+    <w:p>
+      <w:pPr>
+        <w:spacing w:line="276" w:lineRule="auto"/>
+        <w:rPr>
+          <w:rFonts w:asciiTheme="majorBidi" w:hAnsiTheme="majorBidi" w:cstheme="majorBidi"/>
+        </w:rPr>
+      </w:pPr>
+    </w:p>
+    <w:p>
+      <w:pPr>
+        <w:spacing w:line="276" w:lineRule="auto"/>
+        <w:rPr>
+          <w:rFonts w:asciiTheme="majorBidi" w:hAnsiTheme="majorBidi" w:cstheme="majorBidi"/>
+        </w:rPr>
+      </w:pPr>
+      <w:r>
+        <w:rPr>
+          <w:rFonts w:asciiTheme="majorBidi" w:hAnsiTheme="majorBidi" w:cstheme="majorBidi"/>
+        </w:rPr>
+        <w:t>Please include your name and the installment number in the payment note (e.g., "Installment 2 - [Your Name]"). This helps both parties keep accurate records.</w:t>
+      </w:r>
+    </w:p>
+    <w:p>
+      <w:pPr>
+        <w:pBdr>
+          <w:bottom w:val="single" w:sz="4" w:space="1" w:color="auto"/>
+        </w:pBdr>
+        <w:spacing w:line="276" w:lineRule="auto"/>
+        <w:rPr>
+          <w:rFonts w:asciiTheme="majorBidi" w:hAnsiTheme="majorBidi" w:cstheme="majorBidi"/>
+        </w:rPr>
+      </w:pPr>
+      <w:r>
+        <w:rPr>
+          <w:rFonts w:asciiTheme="majorBidi" w:hAnsiTheme="majorBidi" w:cstheme="majorBidi"/>
+          <w:i/>
+          <w:iCs/>
+        </w:rPr>
+        <w:t>Payments sent to any platform or address not listed above will not be considered received until confirmed in writing by the Developer.</w:t>
+      </w:r>
+    </w:p>
+    <w:p>
+      <w:pPr>
+        <w:spacing w:line="276" w:lineRule="auto"/>
+        <w:rPr>
+          <w:rFonts w:asciiTheme="majorBidi" w:hAnsiTheme="majorBidi" w:cstheme="majorBidi"/>
+        </w:rPr>
+      </w:pPr>
       <w:r>
         <w:rPr>
           <w:rFonts w:asciiTheme="majorBidi" w:hAnsiTheme="majorBidi" w:cstheme="majorBidi"/>
@@ -1680,6 +1937,105 @@
           <w:sz w:val="28"/>
           <w:szCs w:val="28"/>
         </w:rPr>
+        <w:t>7</w:t>
+      </w:r>
+      <w:r>
+        <w:rPr>
+          <w:rFonts w:asciiTheme="majorBidi" w:hAnsiTheme="majorBidi" w:cstheme="majorBidi"/>
+          <w:b/>
+          <w:bCs/>
+          <w:sz w:val="28"/>
+          <w:szCs w:val="28"/>
+        </w:rPr>
+        <w:t>. Timeline</w:t>
+      </w:r>
+    </w:p>
+    <w:p>
+      <w:pPr>
+        <w:spacing w:line="276" w:lineRule="auto"/>
+        <w:rPr>
+          <w:rFonts w:asciiTheme="majorBidi" w:hAnsiTheme="majorBidi" w:cstheme="majorBidi"/>
+        </w:rPr>
+      </w:pPr>
+      <w:r>
+        <w:rPr>
+          <w:rFonts w:asciiTheme="majorBidi" w:hAnsiTheme="majorBidi" w:cstheme="majorBidi"/>
+        </w:rPr>
+        <w:t>The project will begin once the deposit and required materials are received.</w:t>
+      </w:r>
+    </w:p>
+    <w:p>
+      <w:pPr>
+        <w:spacing w:line="276" w:lineRule="auto"/>
+        <w:rPr>
+          <w:rFonts w:asciiTheme="majorBidi" w:hAnsiTheme="majorBidi" w:cstheme="majorBidi"/>
+        </w:rPr>
+      </w:pPr>
+      <w:r>
+        <w:rPr>
+          <w:rFonts w:asciiTheme="majorBidi" w:hAnsiTheme="majorBidi" w:cstheme="majorBidi"/>
+        </w:rPr>
+        <w:t>Estimated completion timeline: </w:t>
+      </w:r>
+      <w:r>
+        <w:rPr>
+          <w:rFonts w:asciiTheme="majorBidi" w:hAnsiTheme="majorBidi" w:cstheme="majorBidi"/>
+          <w:b/>
+          <w:bCs/>
+        </w:rPr>
+        <w:t xml:space="preserve">6 </w:t>
+      </w:r>
+      <w:r>
+        <w:rPr>
+          <w:rFonts w:asciiTheme="majorBidi" w:hAnsiTheme="majorBidi" w:cstheme="majorBidi"/>
+          <w:b/>
+          <w:bCs/>
+        </w:rPr>
+        <w:t>weeks</w:t>
+      </w:r>
+    </w:p>
+    <w:p>
+      <w:pPr>
+        <w:pBdr>
+          <w:bottom w:val="single" w:sz="4" w:space="1" w:color="auto"/>
+        </w:pBdr>
+        <w:spacing w:line="276" w:lineRule="auto"/>
+        <w:rPr>
+          <w:rFonts w:asciiTheme="majorBidi" w:hAnsiTheme="majorBidi" w:cstheme="majorBidi"/>
+        </w:rPr>
+      </w:pPr>
+      <w:r>
+        <w:rPr>
+          <w:rFonts w:asciiTheme="majorBidi" w:hAnsiTheme="majorBidi" w:cstheme="majorBidi"/>
+        </w:rPr>
+        <w:t>Delays in receiving materials, approvals, or feedback may extend the project timeline.</w:t>
+      </w:r>
+    </w:p>
+    <w:p>
+      <w:pPr>
+        <w:spacing w:line="276" w:lineRule="auto"/>
+        <w:rPr>
+          <w:rFonts w:asciiTheme="majorBidi" w:hAnsiTheme="majorBidi" w:cstheme="majorBidi"/>
+        </w:rPr>
+      </w:pPr>
+      <w:r>
+        <w:rPr>
+          <w:rFonts w:asciiTheme="majorBidi" w:hAnsiTheme="majorBidi" w:cstheme="majorBidi"/>
+          <w:b/>
+          <w:bCs/>
+          <w:sz w:val="28"/>
+          <w:szCs w:val="28"/>
+        </w:rPr>
+        <w:t>8</w:t>
+      </w:r>
+      <w:r>
+        <w:rPr>
+          <w:rFonts w:asciiTheme="majorBidi" w:hAnsiTheme="majorBidi" w:cstheme="majorBidi"/>
+          <w:b/>
+          <w:bCs/>
+          <w:sz w:val="28"/>
+          <w:szCs w:val="28"/>
+        </w:rPr>
         <w:t>. Client Responsibilities</w:t>
       </w:r>
     </w:p>
@@ -1803,6 +2159,9 @@
     </w:p>
     <w:p>
       <w:pPr>
+        <w:pBdr>
+          <w:bottom w:val="single" w:sz="4" w:space="1" w:color="auto"/>
+        </w:pBdr>
         <w:spacing w:line="276" w:lineRule="auto"/>
         <w:rPr>
           <w:rFonts w:asciiTheme="majorBidi" w:hAnsiTheme="majorBidi" w:cstheme="majorBidi"/>
@@ -1822,19 +2181,6 @@
           <w:rFonts w:asciiTheme="majorBidi" w:hAnsiTheme="majorBidi" w:cstheme="majorBidi"/>
         </w:rPr>
       </w:pPr>
-      <w:r>
-        <w:rPr>
-          <w:noProof/>
-        </w:rPr>
-      </w:r>
-      <w:r>
-        <w:pict w14:anchorId="1D71D581">
-          <v:rect id="Horizontal Line 6" o:spid="_x0000_s1031" style="width:468pt;height:.05pt;visibility:visible;mso-wrap-style:square;mso-left-percent:-10001;mso-top-percent:-10001;mso-position-horizontal:absolute;mso-position-horizontal-relative:char;mso-position-vertical:absolute;mso-position-vertical-relative:line;mso-left-percent:-10001;mso-top-percent:-10001;v-text-anchor:top" o:gfxdata="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" filled="f">
-            <o:lock v:ext="edit" rotation="t" aspectratio="t" verticies="t" text="t" shapetype="t"/>
-            <w10:anchorlock/>
-          </v:rect>
-        </w:pict>
-      </w:r>
       <w:r>
         <w:rPr>
           <w:rFonts w:asciiTheme="majorBidi" w:hAnsiTheme="majorBidi" w:cstheme="majorBidi"/>
@@ -1843,7 +2189,8 @@
           <w:sz w:val="28"/>
           <w:szCs w:val="28"/>
         </w:rPr>
-        <w:t>8</w:t>
+        <w:lastRenderedPageBreak/>
+        <w:t>9</w:t>
       </w:r>
       <w:r>
         <w:rPr>
@@ -1886,6 +2233,9 @@
     </w:p>
     <w:p>
       <w:pPr>
+        <w:pBdr>
+          <w:bottom w:val="single" w:sz="4" w:space="1" w:color="auto"/>
+        </w:pBdr>
         <w:spacing w:line="276" w:lineRule="auto"/>
         <w:rPr>
           <w:rFonts w:asciiTheme="majorBidi" w:hAnsiTheme="majorBidi" w:cstheme="majorBidi"/>
@@ -1919,19 +2269,6 @@
           <w:rFonts w:asciiTheme="majorBidi" w:hAnsiTheme="majorBidi" w:cstheme="majorBidi"/>
         </w:rPr>
       </w:pPr>
-      <w:r>
-        <w:rPr>
-          <w:noProof/>
-        </w:rPr>
-      </w:r>
-      <w:r>
-        <w:pict w14:anchorId="5109CCE7">
-          <v:rect id="Horizontal Line 7" o:spid="_x0000_s1030" style="width:468pt;height:.05pt;visibility:visible;mso-wrap-style:square;mso-left-percent:-10001;mso-top-percent:-10001;mso-position-horizontal:absolute;mso-position-horizontal-relative:char;mso-position-vertical:absolute;mso-position-vertical-relative:line;mso-left-percent:-10001;mso-top-percent:-10001;v-text-anchor:top" o:gfxdata="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" filled="f">
-            <o:lock v:ext="edit" rotation="t" aspectratio="t" verticies="t" text="t" shapetype="t"/>
-            <w10:anchorlock/>
-          </v:rect>
-        </w:pict>
-      </w:r>
       <w:r>
         <w:rPr>
           <w:rFonts w:asciiTheme="majorBidi" w:hAnsiTheme="majorBidi" w:cstheme="majorBidi"/>
@@ -1940,7 +2277,7 @@
           <w:sz w:val="28"/>
           <w:szCs w:val="28"/>
         </w:rPr>
-        <w:t>9</w:t>
+        <w:t>10</w:t>
       </w:r>
       <w:r>
         <w:rPr>
@@ -1955,6 +2292,9 @@
     </w:p>
     <w:p>
       <w:pPr>
+        <w:pBdr>
+          <w:bottom w:val="single" w:sz="4" w:space="1" w:color="auto"/>
+        </w:pBdr>
         <w:spacing w:line="276" w:lineRule="auto"/>
         <w:rPr>
           <w:rFonts w:asciiTheme="majorBidi" w:hAnsiTheme="majorBidi" w:cstheme="majorBidi"/>
@@ -1974,19 +2314,6 @@
           <w:rFonts w:asciiTheme="majorBidi" w:hAnsiTheme="majorBidi" w:cstheme="majorBidi"/>
         </w:rPr>
       </w:pPr>
-      <w:r>
-        <w:rPr>
-          <w:noProof/>
-        </w:rPr>
-      </w:r>
-      <w:r>
-        <w:pict w14:anchorId="25B64863">
-          <v:rect id="Horizontal Line 8" o:spid="_x0000_s1029" style="width:468pt;height:.05pt;visibility:visible;mso-wrap-style:square;mso-left-percent:-10001;mso-top-percent:-10001;mso-position-horizontal:absolute;mso-position-horizontal-relative:char;mso-position-vertical:absolute;mso-position-vertical-relative:line;mso-left-percent:-10001;mso-top-percent:-10001;v-text-anchor:top" o:gfxdata="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" filled="f">
-            <o:lock v:ext="edit" rotation="t" aspectratio="t" verticies="t" text="t" shapetype="t"/>
-            <w10:anchorlock/>
-          </v:rect>
-        </w:pict>
-      </w:r>
       <w:r>
         <w:rPr>
           <w:rFonts w:asciiTheme="majorBidi" w:hAnsiTheme="majorBidi" w:cstheme="majorBidi"/>
@@ -1995,7 +2322,7 @@
           <w:sz w:val="28"/>
           <w:szCs w:val="28"/>
         </w:rPr>
-        <w:t>10</w:t>
+        <w:t>1</w:t>
       </w:r>
       <w:r>
         <w:rPr>
@@ -2005,57 +2332,7 @@
           <w:sz w:val="28"/>
           <w:szCs w:val="28"/>
         </w:rPr>
-        <w:t>. Ownership</w:t>
-      </w:r>
-    </w:p>
-    <w:p>
-      <w:pPr>
-        <w:spacing w:line="276" w:lineRule="auto"/>
-        <w:rPr>
-          <w:rFonts w:asciiTheme="majorBidi" w:hAnsiTheme="majorBidi" w:cstheme="majorBidi"/>
-        </w:rPr>
-      </w:pPr>
-      <w:r>
-        <w:rPr>
-          <w:rFonts w:asciiTheme="majorBidi" w:hAnsiTheme="majorBidi" w:cstheme="majorBidi"/>
-        </w:rPr>
-        <w:t>All design files, code, and website assets remain the property of the Developer until full payment has been received.</w:t>
-      </w:r>
-    </w:p>
-    <w:p>
-      <w:pPr>
-        <w:spacing w:line="276" w:lineRule="auto"/>
-        <w:rPr>
-          <w:rFonts w:asciiTheme="majorBidi" w:hAnsiTheme="majorBidi" w:cstheme="majorBidi"/>
-        </w:rPr>
-      </w:pPr>
-      <w:r>
-        <w:rPr>
-          <w:rFonts w:asciiTheme="majorBidi" w:hAnsiTheme="majorBidi" w:cstheme="majorBidi"/>
-        </w:rPr>
-        <w:lastRenderedPageBreak/>
-        <w:t>Upon full payment, ownership of the completed website transfers to the Client.</w:t>
-      </w:r>
-    </w:p>
-    <w:p>
-      <w:pPr>
-        <w:spacing w:line="276" w:lineRule="auto"/>
-        <w:rPr>
-          <w:rFonts w:asciiTheme="majorBidi" w:hAnsiTheme="majorBidi" w:cstheme="majorBidi"/>
-        </w:rPr>
-      </w:pPr>
-      <w:r>
-        <w:rPr>
-          <w:noProof/>
-        </w:rPr>
-      </w:r>
-      <w:r>
-        <w:pict w14:anchorId="5FE7860F">
-          <v:rect id="Horizontal Line 9" o:spid="_x0000_s1028" style="width:468pt;height:.05pt;visibility:visible;mso-wrap-style:square;mso-left-percent:-10001;mso-top-percent:-10001;mso-position-horizontal:absolute;mso-position-horizontal-relative:char;mso-position-vertical:absolute;mso-position-vertical-relative:line;mso-left-percent:-10001;mso-top-percent:-10001;v-text-anchor:top" o:gfxdata="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" filled="f">
-            <o:lock v:ext="edit" rotation="t" aspectratio="t" verticies="t" text="t" shapetype="t"/>
-            <w10:anchorlock/>
-          </v:rect>
-        </w:pict>
+        <w:t>1</w:t>
       </w:r>
       <w:r>
         <w:rPr>
@@ -2065,8 +2342,47 @@
           <w:sz w:val="28"/>
           <w:szCs w:val="28"/>
         </w:rPr>
-        <w:t>11</w:t>
-      </w:r>
+        <w:t>. Ownership</w:t>
+      </w:r>
+    </w:p>
+    <w:p>
+      <w:pPr>
+        <w:spacing w:line="276" w:lineRule="auto"/>
+        <w:rPr>
+          <w:rFonts w:asciiTheme="majorBidi" w:hAnsiTheme="majorBidi" w:cstheme="majorBidi"/>
+        </w:rPr>
+      </w:pPr>
+      <w:r>
+        <w:rPr>
+          <w:rFonts w:asciiTheme="majorBidi" w:hAnsiTheme="majorBidi" w:cstheme="majorBidi"/>
+        </w:rPr>
+        <w:t>All design files, code, and website assets remain the property of the Developer until full payment has been received.</w:t>
+      </w:r>
+    </w:p>
+    <w:p>
+      <w:pPr>
+        <w:pBdr>
+          <w:bottom w:val="single" w:sz="4" w:space="1" w:color="auto"/>
+        </w:pBdr>
+        <w:spacing w:line="276" w:lineRule="auto"/>
+        <w:rPr>
+          <w:rFonts w:asciiTheme="majorBidi" w:hAnsiTheme="majorBidi" w:cstheme="majorBidi"/>
+        </w:rPr>
+      </w:pPr>
+      <w:r>
+        <w:rPr>
+          <w:rFonts w:asciiTheme="majorBidi" w:hAnsiTheme="majorBidi" w:cstheme="majorBidi"/>
+        </w:rPr>
+        <w:t>Upon full payment, ownership of the completed website transfers to the Client.</w:t>
+      </w:r>
+    </w:p>
+    <w:p>
+      <w:pPr>
+        <w:spacing w:line="276" w:lineRule="auto"/>
+        <w:rPr>
+          <w:rFonts w:asciiTheme="majorBidi" w:hAnsiTheme="majorBidi" w:cstheme="majorBidi"/>
+        </w:rPr>
+      </w:pPr>
       <w:r>
         <w:rPr>
           <w:rFonts w:asciiTheme="majorBidi" w:hAnsiTheme="majorBidi" w:cstheme="majorBidi"/>
@@ -2075,72 +2391,7 @@
           <w:sz w:val="28"/>
           <w:szCs w:val="28"/>
         </w:rPr>
-        <w:t>. Developer Credit</w:t>
-      </w:r>
-    </w:p>
-    <w:p>
-      <w:pPr>
-        <w:spacing w:line="276" w:lineRule="auto"/>
-        <w:rPr>
-          <w:rFonts w:asciiTheme="majorBidi" w:hAnsiTheme="majorBidi" w:cstheme="majorBidi"/>
-        </w:rPr>
-      </w:pPr>
-      <w:r>
-        <w:rPr>
-          <w:rFonts w:asciiTheme="majorBidi" w:hAnsiTheme="majorBidi" w:cstheme="majorBidi"/>
-        </w:rPr>
-        <w:t>The Developer reserves the right to include a small footer credit such as:</w:t>
-      </w:r>
-    </w:p>
-    <w:p>
-      <w:pPr>
-        <w:spacing w:line="276" w:lineRule="auto"/>
-        <w:rPr>
-          <w:rFonts w:asciiTheme="majorBidi" w:hAnsiTheme="majorBidi" w:cstheme="majorBidi"/>
-        </w:rPr>
-      </w:pPr>
-      <w:r>
-        <w:rPr>
-          <w:rFonts w:asciiTheme="majorBidi" w:hAnsiTheme="majorBidi" w:cstheme="majorBidi"/>
-          <w:i/>
-          <w:iCs/>
-        </w:rPr>
-        <w:t>"Website developed by Noah C. Jones."</w:t>
-      </w:r>
-    </w:p>
-    <w:p>
-      <w:pPr>
-        <w:spacing w:line="276" w:lineRule="auto"/>
-        <w:rPr>
-          <w:rFonts w:asciiTheme="majorBidi" w:hAnsiTheme="majorBidi" w:cstheme="majorBidi"/>
-        </w:rPr>
-      </w:pPr>
-      <w:r>
-        <w:rPr>
-          <w:rFonts w:asciiTheme="majorBidi" w:hAnsiTheme="majorBidi" w:cstheme="majorBidi"/>
-        </w:rPr>
-        <w:t>The Developer may also display the project in professional portfolios and marketing materials.</w:t>
-      </w:r>
-    </w:p>
-    <w:p>
-      <w:pPr>
-        <w:spacing w:line="276" w:lineRule="auto"/>
-        <w:rPr>
-          <w:rFonts w:asciiTheme="majorBidi" w:hAnsiTheme="majorBidi" w:cstheme="majorBidi"/>
-        </w:rPr>
-      </w:pPr>
-      <w:r>
-        <w:rPr>
-          <w:noProof/>
-        </w:rPr>
-      </w:r>
-      <w:r>
-        <w:pict w14:anchorId="5E5FEA22">
-          <v:rect id="Horizontal Line 10" o:spid="_x0000_s1027" style="width:468pt;height:.05pt;visibility:visible;mso-wrap-style:square;mso-left-percent:-10001;mso-top-percent:-10001;mso-position-horizontal:absolute;mso-position-horizontal-relative:char;mso-position-vertical:absolute;mso-position-vertical-relative:line;mso-left-percent:-10001;mso-top-percent:-10001;v-text-anchor:top" o:gfxdata="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" filled="f">
-            <o:lock v:ext="edit" rotation="t" aspectratio="t" verticies="t" text="t" shapetype="t"/>
-            <w10:anchorlock/>
-          </v:rect>
-        </w:pict>
+        <w:t>1</w:t>
       </w:r>
       <w:r>
         <w:rPr>
@@ -2150,7 +2401,7 @@
           <w:sz w:val="28"/>
           <w:szCs w:val="28"/>
         </w:rPr>
-        <w:t>1</w:t>
+        <w:t>2</w:t>
       </w:r>
       <w:r>
         <w:rPr>
@@ -2160,8 +2411,63 @@
           <w:sz w:val="28"/>
           <w:szCs w:val="28"/>
         </w:rPr>
-        <w:t>2</w:t>
-      </w:r>
+        <w:t>. Developer Credit</w:t>
+      </w:r>
+    </w:p>
+    <w:p>
+      <w:pPr>
+        <w:spacing w:line="276" w:lineRule="auto"/>
+        <w:rPr>
+          <w:rFonts w:asciiTheme="majorBidi" w:hAnsiTheme="majorBidi" w:cstheme="majorBidi"/>
+        </w:rPr>
+      </w:pPr>
+      <w:r>
+        <w:rPr>
+          <w:rFonts w:asciiTheme="majorBidi" w:hAnsiTheme="majorBidi" w:cstheme="majorBidi"/>
+        </w:rPr>
+        <w:t>The Developer reserves the right to include a small footer credit such as:</w:t>
+      </w:r>
+    </w:p>
+    <w:p>
+      <w:pPr>
+        <w:spacing w:line="276" w:lineRule="auto"/>
+        <w:rPr>
+          <w:rFonts w:asciiTheme="majorBidi" w:hAnsiTheme="majorBidi" w:cstheme="majorBidi"/>
+        </w:rPr>
+      </w:pPr>
+      <w:r>
+        <w:rPr>
+          <w:rFonts w:asciiTheme="majorBidi" w:hAnsiTheme="majorBidi" w:cstheme="majorBidi"/>
+          <w:i/>
+          <w:iCs/>
+        </w:rPr>
+        <w:t>"Website developed by Noah C. Jones."</w:t>
+      </w:r>
+    </w:p>
+    <w:p>
+      <w:pPr>
+        <w:pBdr>
+          <w:bottom w:val="single" w:sz="4" w:space="1" w:color="auto"/>
+        </w:pBdr>
+        <w:spacing w:line="276" w:lineRule="auto"/>
+        <w:rPr>
+          <w:rFonts w:asciiTheme="majorBidi" w:hAnsiTheme="majorBidi" w:cstheme="majorBidi"/>
+        </w:rPr>
+      </w:pPr>
+      <w:r>
+        <w:rPr>
+          <w:rFonts w:asciiTheme="majorBidi" w:hAnsiTheme="majorBidi" w:cstheme="majorBidi"/>
+        </w:rPr>
+        <w:t>The Developer may also display the project in professional portfolios and marketing materials.</w:t>
+      </w:r>
+    </w:p>
+    <w:p>
+      <w:pPr>
+        <w:spacing w:line="276" w:lineRule="auto"/>
+        <w:rPr>
+          <w:rFonts w:asciiTheme="majorBidi" w:hAnsiTheme="majorBidi" w:cstheme="majorBidi"/>
+        </w:rPr>
+      </w:pPr>
       <w:r>
         <w:rPr>
           <w:rFonts w:asciiTheme="majorBidi" w:hAnsiTheme="majorBidi" w:cstheme="majorBidi"/>
@@ -2170,6 +2476,26 @@
           <w:sz w:val="28"/>
           <w:szCs w:val="28"/>
         </w:rPr>
+        <w:t>1</w:t>
+      </w:r>
+      <w:r>
+        <w:rPr>
+          <w:rFonts w:asciiTheme="majorBidi" w:hAnsiTheme="majorBidi" w:cstheme="majorBidi"/>
+          <w:b/>
+          <w:bCs/>
+          <w:sz w:val="28"/>
+          <w:szCs w:val="28"/>
+        </w:rPr>
+        <w:t>3</w:t>
+      </w:r>
+      <w:r>
+        <w:rPr>
+          <w:rFonts w:asciiTheme="majorBidi" w:hAnsiTheme="majorBidi" w:cstheme="majorBidi"/>
+          <w:b/>
+          <w:bCs/>
+          <w:sz w:val="28"/>
+          <w:szCs w:val="28"/>
+        </w:rPr>
         <w:t>. Limitation of Liability</w:t>
       </w:r>
     </w:p>
@@ -2195,13 +2521,8 @@
         </w:rPr>
       </w:pPr>
       <w:r>
-        <w:rPr>
-          <w:noProof/>
-        </w:rPr>
-      </w:r>
-      <w:r>
-        <w:pict w14:anchorId="49BB42C3">
-          <v:rect id="Horizontal Line 11" o:spid="_x0000_s1026" style="width:468pt;height:.05pt;visibility:visible;mso-wrap-style:square;mso-left-percent:-10001;mso-top-percent:-10001;mso-position-horizontal:absolute;mso-position-horizontal-relative:char;mso-position-vertical:absolute;mso-position-vertical-relative:line;mso-left-percent:-10001;mso-top-percent:-10001;v-text-anchor:top" o:gfxdata="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" filled="f">
+        <w:pict w14:anchorId="6412ACFB">
+          <v:rect id="Horizontal Line 11" o:spid="_x0000_s1026" alt="" style="width:468pt;height:.05pt;visibility:visible;mso-wrap-style:square;mso-width-percent:0;mso-height-percent:0;mso-left-percent:-10001;mso-top-percent:-10001;mso-position-horizontal:absolute;mso-position-horizontal-relative:char;mso-position-vertical:absolute;mso-position-vertical-relative:line;mso-width-percent:0;mso-height-percent:0;mso-left-percent:-10001;mso-top-percent:-10001;v-text-anchor:top" filled="f">
             <o:lock v:ext="edit" rotation="t" aspectratio="t" verticies="t" text="t" shapetype="t"/>
             <w10:anchorlock/>
           </v:rect>

</xml_diff>